<commit_message>
Polish heat-transfer notation and add experiment navigation
</commit_message>
<xml_diff>
--- a/labs/parallel-heat-transfer/Parallel_Heat_Transfer_Worksheet.docx
+++ b/labs/parallel-heat-transfer/Parallel_Heat_Transfer_Worksheet.docx
@@ -141,7 +141,55 @@
             <w:rPr>
               <w:rFonts w:ascii="Cambria Math" w:hAnsi="Cambria Math"/>
             </w:rPr>
-            <m:t>Vessel Properties: Dᵢ = 1.00 m; steel thickness = 0.025 m; L = 6.00 m; kₛₜₑₑₗ = 45</m:t>
+            <m:t xml:space="preserve">Vessel Properties: </m:t>
+          </m:r>
+          <m:sSub>
+            <m:e>
+              <m:r>
+                <w:rPr>
+                  <w:rFonts w:ascii="Cambria Math" w:hAnsi="Cambria Math"/>
+                </w:rPr>
+                <m:t xml:space="preserve">D</m:t>
+              </m:r>
+            </m:e>
+            <m:sub>
+              <m:r>
+                <w:rPr>
+                  <w:rFonts w:ascii="Cambria Math" w:hAnsi="Cambria Math"/>
+                </w:rPr>
+                <m:t xml:space="preserve">i</m:t>
+              </m:r>
+            </m:sub>
+          </m:sSub>
+          <m:r>
+            <w:rPr>
+              <w:rFonts w:ascii="Cambria Math" w:hAnsi="Cambria Math"/>
+            </w:rPr>
+            <m:t xml:space="preserve"> = 1.00 m; steel thickness = 0.025 m; L = 6.00 m; </m:t>
+          </m:r>
+          <m:sSub>
+            <m:e>
+              <m:r>
+                <w:rPr>
+                  <w:rFonts w:ascii="Cambria Math" w:hAnsi="Cambria Math"/>
+                </w:rPr>
+                <m:t xml:space="preserve">k</m:t>
+              </m:r>
+            </m:e>
+            <m:sub>
+              <m:r>
+                <w:rPr>
+                  <w:rFonts w:ascii="Cambria Math" w:hAnsi="Cambria Math"/>
+                </w:rPr>
+                <m:t xml:space="preserve">steel</m:t>
+              </m:r>
+            </m:sub>
+          </m:sSub>
+          <m:r>
+            <w:rPr>
+              <w:rFonts w:ascii="Cambria Math" w:hAnsi="Cambria Math"/>
+            </w:rPr>
+            <m:t xml:space="preserve"> = 45</m:t>
           </m:r>
           <m:f>
             <m:fPr>
@@ -627,12 +675,24 @@
         <w:t xml:space="preserve">Select Case A. Set </w:t>
       </w:r>
       <m:oMath>
-        <m:r>
-          <w:rPr>
-            <w:rFonts w:ascii="Cambria Math" w:hAnsi="Cambria Math"/>
-          </w:rPr>
-          <m:t>Tᵢₙ</m:t>
-        </m:r>
+        <m:sSub>
+          <m:e>
+            <m:r>
+              <w:rPr>
+                <w:rFonts w:ascii="Cambria Math" w:hAnsi="Cambria Math"/>
+              </w:rPr>
+              <m:t xml:space="preserve">T</m:t>
+            </m:r>
+          </m:e>
+          <m:sub>
+            <m:r>
+              <w:rPr>
+                <w:rFonts w:ascii="Cambria Math" w:hAnsi="Cambria Math"/>
+              </w:rPr>
+              <m:t xml:space="preserve">in</m:t>
+            </m:r>
+          </m:sub>
+        </m:sSub>
       </m:oMath>
       <w:r>
         <w:t xml:space="preserve"> = 400 °C, insulation thickness </w:t>
@@ -669,12 +729,24 @@
         <w:t xml:space="preserve">= 0.100 m, </w:t>
       </w:r>
       <m:oMath>
-        <m:r>
-          <w:rPr>
-            <w:rFonts w:ascii="Cambria Math" w:hAnsi="Cambria Math"/>
-          </w:rPr>
-          <m:t>kᵢₙₛ</m:t>
-        </m:r>
+        <m:sSub>
+          <m:e>
+            <m:r>
+              <w:rPr>
+                <w:rFonts w:ascii="Cambria Math" w:hAnsi="Cambria Math"/>
+              </w:rPr>
+              <m:t xml:space="preserve">k</m:t>
+            </m:r>
+          </m:e>
+          <m:sub>
+            <m:r>
+              <w:rPr>
+                <w:rFonts w:ascii="Cambria Math" w:hAnsi="Cambria Math"/>
+              </w:rPr>
+              <m:t xml:space="preserve">ins</m:t>
+            </m:r>
+          </m:sub>
+        </m:sSub>
       </m:oMath>
       <w:r>
         <w:t xml:space="preserve"> = 0.080 W/(m·K).</w:t>
@@ -688,7 +760,17 @@
         </w:numPr>
       </w:pPr>
       <w:r>
-        <w:t xml:space="preserve">For Trial 1, set ε = 0.00 and h = 8 W/(m²·K). </w:t>
+        <w:t xml:space="preserve">For Trial 1, set ε = 0.00 and h = 8 W/(m</w:t>
+      </w:r>
+      <w:r>
+        <w:rPr>
+          <w:sz w:val="22"/>
+          <w:vertAlign w:val="superscript"/>
+        </w:rPr>
+        <w:t xml:space="preserve">2</w:t>
+      </w:r>
+      <w:r>
+        <w:t xml:space="preserve">·K). </w:t>
       </w:r>
     </w:p>
     <w:p>
@@ -699,7 +781,17 @@
         </w:numPr>
       </w:pPr>
       <w:r>
-        <w:t>For Trial 2, change only ε to 0.85 and h to 0 W/(m²·K). Run the case and record the outputs.</w:t>
+        <w:t xml:space="preserve">For Trial 2, change only ε to 0.85 and h to 0 W/(m</w:t>
+      </w:r>
+      <w:r>
+        <w:rPr>
+          <w:sz w:val="22"/>
+          <w:vertAlign w:val="superscript"/>
+        </w:rPr>
+        <w:t xml:space="preserve">2</w:t>
+      </w:r>
+      <w:r>
+        <w:t xml:space="preserve">·K). Run the case and record the outputs.</w:t>
       </w:r>
     </w:p>
     <w:p>
@@ -710,10 +802,23 @@
         </w:numPr>
       </w:pPr>
       <w:r>
-        <w:t>For Trial 3, use ε = 0.85 and h = 8 W/(m²·K). Run the case and record the outputs.</w:t>
-      </w:r>
-    </w:p>
-    <w:p>
+        <w:t xml:space="preserve">For Trial 3, use ε = 0.85 and h = 8 W/(m</w:t>
+      </w:r>
+      <w:r>
+        <w:rPr>
+          <w:sz w:val="22"/>
+          <w:vertAlign w:val="superscript"/>
+        </w:rPr>
+        <w:t xml:space="preserve">2</w:t>
+      </w:r>
+      <w:r>
+        <w:t xml:space="preserve">·K). Run the case and record the outputs.</w:t>
+      </w:r>
+    </w:p>
+    <w:p>
+      <w:pPr>
+        <w:keepNext/>
+      </w:pPr>
       <w:r>
         <w:rPr>
           <w:b/>
@@ -760,9 +865,15 @@
               <w:right w:w="90" w:type="dxa"/>
             </w:tcMar>
             <w:vAlign w:val="center"/>
+            <w:tcMar>
+              <w:left w:w="20" w:type="dxa"/>
+              <w:right w:w="20" w:type="dxa"/>
+            </w:tcMar>
           </w:tcPr>
           <w:p>
             <w:pPr>
+              <w:keepNext/>
+              <w:spacing w:after="40" w:before="40"/>
               <w:rPr>
                 <w:b/>
                 <w:bCs/>
@@ -772,6 +883,7 @@
               <w:rPr>
                 <w:b/>
                 <w:bCs/>
+                <w:sz w:val="20"/>
               </w:rPr>
               <w:t>Trials</w:t>
             </w:r>
@@ -795,6 +907,10 @@
             <w:vAlign w:val="center"/>
           </w:tcPr>
           <w:p>
+            <w:pPr>
+              <w:keepNext/>
+              <w:spacing w:after="40" w:before="40"/>
+            </w:pPr>
             <m:oMathPara>
               <m:oMath>
                 <m:r>
@@ -803,6 +919,7 @@
                   </m:rPr>
                   <w:rPr>
                     <w:rFonts w:ascii="Cambria Math" w:hAnsi="Cambria Math"/>
+                    <w:sz w:val="20"/>
                   </w:rPr>
                   <m:t>ε</m:t>
                 </m:r>
@@ -828,6 +945,10 @@
             <w:vAlign w:val="center"/>
           </w:tcPr>
           <w:p>
+            <w:pPr>
+              <w:keepNext/>
+              <w:spacing w:after="40" w:before="40"/>
+            </w:pPr>
             <m:oMathPara>
               <m:oMath>
                 <m:r>
@@ -836,6 +957,7 @@
                   </m:rPr>
                   <w:rPr>
                     <w:rFonts w:ascii="Cambria Math" w:hAnsi="Cambria Math"/>
+                    <w:sz w:val="20"/>
                   </w:rPr>
                   <m:t>h</m:t>
                 </m:r>
@@ -845,6 +967,7 @@
                   </m:rPr>
                   <w:rPr>
                     <w:rFonts w:ascii="Cambria Math" w:hAnsi="Cambria Math"/>
+                    <w:sz w:val="20"/>
                   </w:rPr>
                   <w:br/>
                 </m:r>
@@ -853,18 +976,36 @@
             <w:r>
               <w:rPr>
                 <w:bCs/>
+                <w:sz w:val="20"/>
               </w:rPr>
               <w:t>[</w:t>
             </w:r>
             <w:r>
               <w:rPr>
                 <w:b/>
+                <w:sz w:val="20"/>
               </w:rPr>
-              <w:t>W/m²·K</w:t>
+              <w:t xml:space="preserve">W/m</w:t>
+            </w:r>
+            <w:r>
+              <w:rPr>
+                <w:b/>
+                <w:sz w:val="20"/>
+                <w:vertAlign w:val="superscript"/>
+              </w:rPr>
+              <w:t xml:space="preserve">2</w:t>
+            </w:r>
+            <w:r>
+              <w:rPr>
+                <w:b/>
+                <w:sz w:val="20"/>
+              </w:rPr>
+              <w:t xml:space="preserve">·K</w:t>
             </w:r>
             <w:r>
               <w:rPr>
                 <w:bCs/>
+                <w:sz w:val="20"/>
               </w:rPr>
               <w:t>]</w:t>
             </w:r>
@@ -888,23 +1029,45 @@
             <w:vAlign w:val="center"/>
           </w:tcPr>
           <w:p>
+            <w:pPr>
+              <w:keepNext/>
+              <w:spacing w:after="40" w:before="40"/>
+            </w:pPr>
             <m:oMathPara>
               <m:oMath>
-                <m:r>
-                  <m:rPr>
-                    <m:sty m:val="bi"/>
-                  </m:rPr>
-                  <w:rPr>
-                    <w:rFonts w:ascii="Cambria Math" w:hAnsi="Cambria Math"/>
-                  </w:rPr>
-                  <m:t>Tₛ</m:t>
-                </m:r>
+                <m:sSub>
+                  <m:e>
+                    <m:r>
+                      <m:rPr>
+                        <m:sty m:val="bi"/>
+                      </m:rPr>
+                      <w:rPr>
+                        <w:rFonts w:ascii="Cambria Math" w:hAnsi="Cambria Math"/>
+                        <w:sz w:val="20"/>
+                      </w:rPr>
+                      <m:t xml:space="preserve">T</m:t>
+                    </m:r>
+                  </m:e>
+                  <m:sub>
+                    <m:r>
+                      <m:rPr>
+                        <m:sty m:val="bi"/>
+                      </m:rPr>
+                      <w:rPr>
+                        <w:rFonts w:ascii="Cambria Math" w:hAnsi="Cambria Math"/>
+                        <w:sz w:val="20"/>
+                      </w:rPr>
+                      <m:t xml:space="preserve">s</m:t>
+                    </m:r>
+                  </m:sub>
+                </m:sSub>
                 <m:r>
                   <m:rPr>
                     <m:sty m:val="p"/>
                   </m:rPr>
                   <w:rPr>
                     <w:rFonts w:ascii="Cambria Math" w:hAnsi="Cambria Math"/>
+                    <w:sz w:val="20"/>
                   </w:rPr>
                   <w:br/>
                 </m:r>
@@ -913,18 +1076,21 @@
             <w:r>
               <w:rPr>
                 <w:bCs/>
+                <w:sz w:val="20"/>
               </w:rPr>
               <w:t>[°</w:t>
             </w:r>
             <w:r>
               <w:rPr>
                 <w:b/>
+                <w:sz w:val="20"/>
               </w:rPr>
               <w:t>C</w:t>
             </w:r>
             <w:r>
               <w:rPr>
                 <w:bCs/>
+                <w:sz w:val="20"/>
               </w:rPr>
               <w:t>]</w:t>
             </w:r>
@@ -949,6 +1115,8 @@
           </w:tcPr>
           <w:p>
             <w:pPr>
+              <w:keepNext/>
+              <w:spacing w:after="40" w:before="40"/>
               <w:rPr>
                 <w:rFonts w:ascii="Cambria Math" w:hAnsi="Cambria Math"/>
                 <w:oMath/>
@@ -985,6 +1153,7 @@
                           </m:rPr>
                           <w:rPr>
                             <w:rFonts w:ascii="Cambria Math" w:hAnsi="Cambria Math"/>
+                            <w:sz w:val="20"/>
                           </w:rPr>
                           <m:t>Q</m:t>
                         </m:r>
@@ -998,6 +1167,7 @@
                       </m:rPr>
                       <w:rPr>
                         <w:rFonts w:ascii="Cambria Math" w:hAnsi="Cambria Math"/>
+                        <w:sz w:val="20"/>
                       </w:rPr>
                       <m:t>conv</m:t>
                     </m:r>
@@ -1009,6 +1179,7 @@
                   </m:rPr>
                   <w:rPr>
                     <w:rFonts w:ascii="Cambria Math" w:hAnsi="Cambria Math"/>
+                    <w:sz w:val="20"/>
                   </w:rPr>
                   <w:br/>
                 </m:r>
@@ -1020,6 +1191,7 @@
                   </m:rPr>
                   <w:rPr>
                     <w:rFonts w:ascii="Cambria Math" w:hAnsi="Cambria Math"/>
+                    <w:sz w:val="20"/>
                   </w:rPr>
                   <m:t>[kW]</m:t>
                 </m:r>
@@ -1046,6 +1218,8 @@
           </w:tcPr>
           <w:p>
             <w:pPr>
+              <w:keepNext/>
+              <w:spacing w:after="40" w:before="40"/>
               <w:rPr>
                 <w:rFonts w:ascii="Cambria Math" w:hAnsi="Cambria Math"/>
                 <w:oMath/>
@@ -1082,6 +1256,7 @@
                           </m:rPr>
                           <w:rPr>
                             <w:rFonts w:ascii="Cambria Math" w:hAnsi="Cambria Math"/>
+                            <w:sz w:val="20"/>
                           </w:rPr>
                           <m:t>Q</m:t>
                         </m:r>
@@ -1095,6 +1270,7 @@
                       </m:rPr>
                       <w:rPr>
                         <w:rFonts w:ascii="Cambria Math" w:hAnsi="Cambria Math"/>
+                        <w:sz w:val="20"/>
                       </w:rPr>
                       <m:t>rad</m:t>
                     </m:r>
@@ -1106,6 +1282,7 @@
                   </m:rPr>
                   <w:rPr>
                     <w:rFonts w:ascii="Cambria Math" w:hAnsi="Cambria Math"/>
+                    <w:sz w:val="20"/>
                   </w:rPr>
                   <w:br/>
                 </m:r>
@@ -1117,6 +1294,7 @@
                   </m:rPr>
                   <w:rPr>
                     <w:rFonts w:ascii="Cambria Math" w:hAnsi="Cambria Math"/>
+                    <w:sz w:val="20"/>
                   </w:rPr>
                   <m:t>[kW]</m:t>
                 </m:r>
@@ -1143,6 +1321,8 @@
           </w:tcPr>
           <w:p>
             <w:pPr>
+              <w:keepNext/>
+              <w:spacing w:after="40" w:before="40"/>
               <w:rPr>
                 <w:rFonts w:ascii="Cambria Math" w:hAnsi="Cambria Math"/>
                 <w:oMath/>
@@ -1179,6 +1359,7 @@
                           </m:rPr>
                           <w:rPr>
                             <w:rFonts w:ascii="Cambria Math" w:hAnsi="Cambria Math"/>
+                            <w:sz w:val="20"/>
                           </w:rPr>
                           <m:t>Q</m:t>
                         </m:r>
@@ -1192,6 +1373,7 @@
                       </m:rPr>
                       <w:rPr>
                         <w:rFonts w:ascii="Cambria Math" w:hAnsi="Cambria Math"/>
+                        <w:sz w:val="20"/>
                       </w:rPr>
                       <m:t>total</m:t>
                     </m:r>
@@ -1203,6 +1385,7 @@
                   </m:rPr>
                   <w:rPr>
                     <w:rFonts w:ascii="Cambria Math" w:hAnsi="Cambria Math"/>
+                    <w:sz w:val="20"/>
                   </w:rPr>
                   <w:br/>
                 </m:r>
@@ -1214,6 +1397,7 @@
                   </m:rPr>
                   <w:rPr>
                     <w:rFonts w:ascii="Cambria Math" w:hAnsi="Cambria Math"/>
+                    <w:sz w:val="20"/>
                   </w:rPr>
                   <m:t>[kW]</m:t>
                 </m:r>
@@ -1245,6 +1429,10 @@
             <w:vAlign w:val="center"/>
           </w:tcPr>
           <w:p>
+            <w:pPr>
+              <w:keepNext/>
+              <w:spacing w:after="40" w:before="40"/>
+            </w:pPr>
             <w:r>
               <w:t>1</w:t>
             </w:r>
@@ -1268,6 +1456,10 @@
             <w:vAlign w:val="center"/>
           </w:tcPr>
           <w:p>
+            <w:pPr>
+              <w:keepNext/>
+              <w:spacing w:after="40" w:before="40"/>
+            </w:pPr>
             <w:r>
               <w:t>0.00</w:t>
             </w:r>
@@ -1291,6 +1483,10 @@
             <w:vAlign w:val="center"/>
           </w:tcPr>
           <w:p>
+            <w:pPr>
+              <w:keepNext/>
+              <w:spacing w:after="40" w:before="40"/>
+            </w:pPr>
             <w:r>
               <w:t>8</w:t>
             </w:r>
@@ -1313,7 +1509,12 @@
             </w:tcMar>
             <w:vAlign w:val="center"/>
           </w:tcPr>
-          <w:p/>
+          <w:p>
+            <w:pPr>
+              <w:keepNext/>
+              <w:spacing w:after="40" w:before="40"/>
+            </w:pPr>
+          </w:p>
         </w:tc>
         <w:tc>
           <w:tcPr>
@@ -1332,7 +1533,12 @@
             </w:tcMar>
             <w:vAlign w:val="center"/>
           </w:tcPr>
-          <w:p/>
+          <w:p>
+            <w:pPr>
+              <w:keepNext/>
+              <w:spacing w:after="40" w:before="40"/>
+            </w:pPr>
+          </w:p>
         </w:tc>
         <w:tc>
           <w:tcPr>
@@ -1351,7 +1557,12 @@
             </w:tcMar>
             <w:vAlign w:val="center"/>
           </w:tcPr>
-          <w:p/>
+          <w:p>
+            <w:pPr>
+              <w:keepNext/>
+              <w:spacing w:after="40" w:before="40"/>
+            </w:pPr>
+          </w:p>
         </w:tc>
         <w:tc>
           <w:tcPr>
@@ -1370,7 +1581,12 @@
             </w:tcMar>
             <w:vAlign w:val="center"/>
           </w:tcPr>
-          <w:p/>
+          <w:p>
+            <w:pPr>
+              <w:keepNext/>
+              <w:spacing w:after="40" w:before="40"/>
+            </w:pPr>
+          </w:p>
         </w:tc>
       </w:tr>
       <w:tr>
@@ -1396,6 +1612,10 @@
             <w:vAlign w:val="center"/>
           </w:tcPr>
           <w:p>
+            <w:pPr>
+              <w:keepNext/>
+              <w:spacing w:after="40" w:before="40"/>
+            </w:pPr>
             <w:r>
               <w:t>2</w:t>
             </w:r>
@@ -1419,6 +1639,10 @@
             <w:vAlign w:val="center"/>
           </w:tcPr>
           <w:p>
+            <w:pPr>
+              <w:keepNext/>
+              <w:spacing w:after="40" w:before="40"/>
+            </w:pPr>
             <w:r>
               <w:t>0.85</w:t>
             </w:r>
@@ -1442,6 +1666,10 @@
             <w:vAlign w:val="center"/>
           </w:tcPr>
           <w:p>
+            <w:pPr>
+              <w:keepNext/>
+              <w:spacing w:after="40" w:before="40"/>
+            </w:pPr>
             <w:r>
               <w:t>0</w:t>
             </w:r>
@@ -1464,7 +1692,12 @@
             </w:tcMar>
             <w:vAlign w:val="center"/>
           </w:tcPr>
-          <w:p/>
+          <w:p>
+            <w:pPr>
+              <w:keepNext/>
+              <w:spacing w:after="40" w:before="40"/>
+            </w:pPr>
+          </w:p>
         </w:tc>
         <w:tc>
           <w:tcPr>
@@ -1483,7 +1716,12 @@
             </w:tcMar>
             <w:vAlign w:val="center"/>
           </w:tcPr>
-          <w:p/>
+          <w:p>
+            <w:pPr>
+              <w:keepNext/>
+              <w:spacing w:after="40" w:before="40"/>
+            </w:pPr>
+          </w:p>
         </w:tc>
         <w:tc>
           <w:tcPr>
@@ -1502,7 +1740,12 @@
             </w:tcMar>
             <w:vAlign w:val="center"/>
           </w:tcPr>
-          <w:p/>
+          <w:p>
+            <w:pPr>
+              <w:keepNext/>
+              <w:spacing w:after="40" w:before="40"/>
+            </w:pPr>
+          </w:p>
         </w:tc>
         <w:tc>
           <w:tcPr>
@@ -1521,7 +1764,12 @@
             </w:tcMar>
             <w:vAlign w:val="center"/>
           </w:tcPr>
-          <w:p/>
+          <w:p>
+            <w:pPr>
+              <w:keepNext/>
+              <w:spacing w:after="40" w:before="40"/>
+            </w:pPr>
+          </w:p>
         </w:tc>
       </w:tr>
       <w:tr>
@@ -1547,6 +1795,10 @@
             <w:vAlign w:val="center"/>
           </w:tcPr>
           <w:p>
+            <w:pPr>
+              <w:keepNext w:val="0"/>
+              <w:spacing w:after="40" w:before="40"/>
+            </w:pPr>
             <w:r>
               <w:t>3</w:t>
             </w:r>
@@ -1570,6 +1822,10 @@
             <w:vAlign w:val="center"/>
           </w:tcPr>
           <w:p>
+            <w:pPr>
+              <w:keepNext w:val="0"/>
+              <w:spacing w:after="40" w:before="40"/>
+            </w:pPr>
             <w:r>
               <w:t>0.85</w:t>
             </w:r>
@@ -1593,6 +1849,10 @@
             <w:vAlign w:val="center"/>
           </w:tcPr>
           <w:p>
+            <w:pPr>
+              <w:keepNext w:val="0"/>
+              <w:spacing w:after="40" w:before="40"/>
+            </w:pPr>
             <w:r>
               <w:t>8</w:t>
             </w:r>
@@ -1615,7 +1875,12 @@
             </w:tcMar>
             <w:vAlign w:val="center"/>
           </w:tcPr>
-          <w:p/>
+          <w:p>
+            <w:pPr>
+              <w:keepNext w:val="0"/>
+              <w:spacing w:after="40" w:before="40"/>
+            </w:pPr>
+          </w:p>
         </w:tc>
         <w:tc>
           <w:tcPr>
@@ -1634,7 +1899,12 @@
             </w:tcMar>
             <w:vAlign w:val="center"/>
           </w:tcPr>
-          <w:p/>
+          <w:p>
+            <w:pPr>
+              <w:keepNext w:val="0"/>
+              <w:spacing w:after="40" w:before="40"/>
+            </w:pPr>
+          </w:p>
         </w:tc>
         <w:tc>
           <w:tcPr>
@@ -1653,7 +1923,12 @@
             </w:tcMar>
             <w:vAlign w:val="center"/>
           </w:tcPr>
-          <w:p/>
+          <w:p>
+            <w:pPr>
+              <w:keepNext w:val="0"/>
+              <w:spacing w:after="40" w:before="40"/>
+            </w:pPr>
+          </w:p>
         </w:tc>
         <w:tc>
           <w:tcPr>
@@ -1672,7 +1947,12 @@
             </w:tcMar>
             <w:vAlign w:val="center"/>
           </w:tcPr>
-          <w:p/>
+          <w:p>
+            <w:pPr>
+              <w:keepNext w:val="0"/>
+              <w:spacing w:after="40" w:before="40"/>
+            </w:pPr>
+          </w:p>
         </w:tc>
       </w:tr>
     </w:tbl>
@@ -1687,13 +1967,25 @@
     </w:p>
     <w:p>
       <w:r>
-        <w:t>Use the relationships below. Here, h is the convection coefficient, ε is emissivity, Aₒ is the insulated outside area, T</w:t>
+        <w:t xml:space="preserve">Use the relationships below. Here, h is the convection coefficient, ε is emissivity, A</w:t>
+      </w:r>
+      <w:r>
+        <w:rPr>
+          <w:sz w:val="22"/>
+          <w:vertAlign w:val="subscript"/>
+        </w:rPr>
+        <w:t xml:space="preserve">o</w:t>
+      </w:r>
+      <w:r>
+        <w:t xml:space="preserve"> is the insulated outside area, T</w:t>
       </w:r>
       <w:r>
         <w:rPr>
           <w:rFonts w:ascii="Cambria Math" w:hAnsi="Cambria Math" w:cs="Cambria Math"/>
-        </w:rPr>
-        <w:t>ₛ</w:t>
+          <w:sz w:val="22"/>
+          <w:vertAlign w:val="subscript"/>
+        </w:rPr>
+        <w:t xml:space="preserve">s</w:t>
       </w:r>
       <w:r>
         <w:t xml:space="preserve"> is the outer-surface temperature, and T</w:t>
@@ -1701,6 +1993,8 @@
       <w:r>
         <w:rPr>
           <w:rFonts w:cs="Arial"/>
+          <w:sz w:val="22"/>
+          <w:vertAlign w:val="subscript"/>
         </w:rPr>
         <w:t>∞</w:t>
       </w:r>
@@ -2464,26 +2758,60 @@
         <w:t xml:space="preserve">Case A. Set </w:t>
       </w:r>
       <m:oMath>
-        <m:r>
-          <w:rPr>
-            <w:rFonts w:ascii="Cambria Math" w:hAnsi="Cambria Math"/>
-          </w:rPr>
-          <m:t>Tᵢₙ</m:t>
-        </m:r>
+        <m:sSub>
+          <m:e>
+            <m:r>
+              <w:rPr>
+                <w:rFonts w:ascii="Cambria Math" w:hAnsi="Cambria Math"/>
+              </w:rPr>
+              <m:t xml:space="preserve">T</m:t>
+            </m:r>
+          </m:e>
+          <m:sub>
+            <m:r>
+              <w:rPr>
+                <w:rFonts w:ascii="Cambria Math" w:hAnsi="Cambria Math"/>
+              </w:rPr>
+              <m:t xml:space="preserve">in</m:t>
+            </m:r>
+          </m:sub>
+        </m:sSub>
       </m:oMath>
       <w:r>
         <w:t xml:space="preserve"> = 600 °C, </w:t>
       </w:r>
       <m:oMath>
-        <m:r>
-          <w:rPr>
-            <w:rFonts w:ascii="Cambria Math" w:hAnsi="Cambria Math"/>
-          </w:rPr>
-          <m:t>kᵢₙₛ</m:t>
-        </m:r>
+        <m:sSub>
+          <m:e>
+            <m:r>
+              <w:rPr>
+                <w:rFonts w:ascii="Cambria Math" w:hAnsi="Cambria Math"/>
+              </w:rPr>
+              <m:t xml:space="preserve">k</m:t>
+            </m:r>
+          </m:e>
+          <m:sub>
+            <m:r>
+              <w:rPr>
+                <w:rFonts w:ascii="Cambria Math" w:hAnsi="Cambria Math"/>
+              </w:rPr>
+              <m:t xml:space="preserve">ins</m:t>
+            </m:r>
+          </m:sub>
+        </m:sSub>
       </m:oMath>
       <w:r>
-        <w:t xml:space="preserve"> = 0.080 W/(m·K), h = 8 W/(m²·K), ε = 0.85.</w:t>
+        <w:t xml:space="preserve"> = 0.080 W/(m·K), h = 8 W/(m</w:t>
+      </w:r>
+      <w:r>
+        <w:rPr>
+          <w:sz w:val="22"/>
+          <w:vertAlign w:val="superscript"/>
+        </w:rPr>
+        <w:t xml:space="preserve">2</w:t>
+      </w:r>
+      <w:r>
+        <w:t xml:space="preserve">·K), ε = 0.85.</w:t>
       </w:r>
     </w:p>
     <w:p>
@@ -2531,6 +2859,9 @@
       </w:r>
     </w:p>
     <w:p>
+      <w:pPr>
+        <w:keepNext/>
+      </w:pPr>
       <w:r>
         <w:rPr>
           <w:b/>
@@ -2580,6 +2911,8 @@
           </w:tcPr>
           <w:p>
             <w:pPr>
+              <w:keepNext/>
+              <w:spacing w:after="40" w:before="40"/>
               <w:rPr>
                 <w:rFonts w:ascii="Cambria Math" w:hAnsi="Cambria Math"/>
                 <w:oMath/>
@@ -2593,6 +2926,7 @@
                   </m:rPr>
                   <w:rPr>
                     <w:rFonts w:ascii="Cambria Math" w:hAnsi="Cambria Math"/>
+                    <w:sz w:val="20"/>
                   </w:rPr>
                   <m:t>Trials</m:t>
                 </m:r>
@@ -2619,6 +2953,8 @@
           </w:tcPr>
           <w:p>
             <w:pPr>
+              <w:keepNext/>
+              <w:spacing w:after="40" w:before="40"/>
               <w:rPr>
                 <w:rFonts w:ascii="Cambria Math" w:hAnsi="Cambria Math"/>
                 <w:oMath/>
@@ -2643,6 +2979,7 @@
                       </m:rPr>
                       <w:rPr>
                         <w:rFonts w:ascii="Cambria Math" w:hAnsi="Cambria Math"/>
+                        <w:sz w:val="20"/>
                       </w:rPr>
                       <m:t>t</m:t>
                     </m:r>
@@ -2654,6 +2991,7 @@
                       </m:rPr>
                       <w:rPr>
                         <w:rFonts w:ascii="Cambria Math" w:hAnsi="Cambria Math"/>
+                        <w:sz w:val="20"/>
                       </w:rPr>
                       <m:t>ins</m:t>
                     </m:r>
@@ -2665,6 +3003,7 @@
                   </m:rPr>
                   <w:rPr>
                     <w:rFonts w:ascii="Cambria Math" w:hAnsi="Cambria Math"/>
+                    <w:sz w:val="20"/>
                   </w:rPr>
                   <w:br/>
                 </m:r>
@@ -2676,6 +3015,7 @@
                   </m:rPr>
                   <w:rPr>
                     <w:rFonts w:ascii="Cambria Math" w:hAnsi="Cambria Math"/>
+                    <w:sz w:val="20"/>
                   </w:rPr>
                   <m:t>[m]</m:t>
                 </m:r>
@@ -2702,6 +3042,8 @@
           </w:tcPr>
           <w:p>
             <w:pPr>
+              <w:keepNext/>
+              <w:spacing w:after="40" w:before="40"/>
               <w:rPr>
                 <w:rFonts w:ascii="Cambria Math" w:hAnsi="Cambria Math"/>
                 <w:oMath/>
@@ -2709,21 +3051,39 @@
             </w:pPr>
             <m:oMathPara>
               <m:oMath>
-                <m:r>
-                  <m:rPr>
-                    <m:sty m:val="bi"/>
-                  </m:rPr>
-                  <w:rPr>
-                    <w:rFonts w:ascii="Cambria Math" w:hAnsi="Cambria Math"/>
-                  </w:rPr>
-                  <m:t>Tₛ</m:t>
-                </m:r>
+                <m:sSub>
+                  <m:e>
+                    <m:r>
+                      <m:rPr>
+                        <m:sty m:val="bi"/>
+                      </m:rPr>
+                      <w:rPr>
+                        <w:rFonts w:ascii="Cambria Math" w:hAnsi="Cambria Math"/>
+                        <w:sz w:val="20"/>
+                      </w:rPr>
+                      <m:t xml:space="preserve">T</m:t>
+                    </m:r>
+                  </m:e>
+                  <m:sub>
+                    <m:r>
+                      <m:rPr>
+                        <m:sty m:val="bi"/>
+                      </m:rPr>
+                      <w:rPr>
+                        <w:rFonts w:ascii="Cambria Math" w:hAnsi="Cambria Math"/>
+                        <w:sz w:val="20"/>
+                      </w:rPr>
+                      <m:t xml:space="preserve">s</m:t>
+                    </m:r>
+                  </m:sub>
+                </m:sSub>
                 <m:r>
                   <m:rPr>
                     <m:sty m:val="p"/>
                   </m:rPr>
                   <w:rPr>
                     <w:rFonts w:ascii="Cambria Math" w:hAnsi="Cambria Math"/>
+                    <w:sz w:val="20"/>
                   </w:rPr>
                   <w:br/>
                 </m:r>
@@ -2735,6 +3095,7 @@
                   </m:rPr>
                   <w:rPr>
                     <w:rFonts w:ascii="Cambria Math" w:hAnsi="Cambria Math"/>
+                    <w:sz w:val="20"/>
                   </w:rPr>
                   <m:t>[°C]</m:t>
                 </m:r>
@@ -2761,6 +3122,8 @@
           </w:tcPr>
           <w:p>
             <w:pPr>
+              <w:keepNext/>
+              <w:spacing w:after="40" w:before="40"/>
               <w:rPr>
                 <w:rFonts w:ascii="Cambria Math" w:hAnsi="Cambria Math"/>
                 <w:oMath/>
@@ -2797,6 +3160,7 @@
                           </m:rPr>
                           <w:rPr>
                             <w:rFonts w:ascii="Cambria Math" w:hAnsi="Cambria Math"/>
+                            <w:sz w:val="20"/>
                           </w:rPr>
                           <m:t>Q</m:t>
                         </m:r>
@@ -2810,6 +3174,7 @@
                       </m:rPr>
                       <w:rPr>
                         <w:rFonts w:ascii="Cambria Math" w:hAnsi="Cambria Math"/>
+                        <w:sz w:val="20"/>
                       </w:rPr>
                       <m:t>cond</m:t>
                     </m:r>
@@ -2821,6 +3186,7 @@
                   </m:rPr>
                   <w:rPr>
                     <w:rFonts w:ascii="Cambria Math" w:hAnsi="Cambria Math"/>
+                    <w:sz w:val="20"/>
                   </w:rPr>
                   <w:br/>
                 </m:r>
@@ -2832,6 +3198,7 @@
                   </m:rPr>
                   <w:rPr>
                     <w:rFonts w:ascii="Cambria Math" w:hAnsi="Cambria Math"/>
+                    <w:sz w:val="20"/>
                   </w:rPr>
                   <m:t>[kW]</m:t>
                 </m:r>
@@ -2858,6 +3225,8 @@
           </w:tcPr>
           <w:p>
             <w:pPr>
+              <w:keepNext/>
+              <w:spacing w:after="40" w:before="40"/>
               <w:rPr>
                 <w:rFonts w:ascii="Cambria Math" w:hAnsi="Cambria Math"/>
                 <w:oMath/>
@@ -2894,6 +3263,7 @@
                           </m:rPr>
                           <w:rPr>
                             <w:rFonts w:ascii="Cambria Math" w:hAnsi="Cambria Math"/>
+                            <w:sz w:val="20"/>
                           </w:rPr>
                           <m:t>Q</m:t>
                         </m:r>
@@ -2907,6 +3277,7 @@
                       </m:rPr>
                       <w:rPr>
                         <w:rFonts w:ascii="Cambria Math" w:hAnsi="Cambria Math"/>
+                        <w:sz w:val="20"/>
                       </w:rPr>
                       <m:t>conv</m:t>
                     </m:r>
@@ -2918,6 +3289,7 @@
                   </m:rPr>
                   <w:rPr>
                     <w:rFonts w:ascii="Cambria Math" w:hAnsi="Cambria Math"/>
+                    <w:sz w:val="20"/>
                   </w:rPr>
                   <w:br/>
                 </m:r>
@@ -2929,6 +3301,7 @@
                   </m:rPr>
                   <w:rPr>
                     <w:rFonts w:ascii="Cambria Math" w:hAnsi="Cambria Math"/>
+                    <w:sz w:val="20"/>
                   </w:rPr>
                   <m:t>[kW]</m:t>
                 </m:r>
@@ -2955,6 +3328,8 @@
           </w:tcPr>
           <w:p>
             <w:pPr>
+              <w:keepNext/>
+              <w:spacing w:after="40" w:before="40"/>
               <w:rPr>
                 <w:rFonts w:ascii="Cambria Math" w:hAnsi="Cambria Math"/>
                 <w:oMath/>
@@ -2991,6 +3366,7 @@
                           </m:rPr>
                           <w:rPr>
                             <w:rFonts w:ascii="Cambria Math" w:hAnsi="Cambria Math"/>
+                            <w:sz w:val="20"/>
                           </w:rPr>
                           <m:t>Q</m:t>
                         </m:r>
@@ -3004,6 +3380,7 @@
                       </m:rPr>
                       <w:rPr>
                         <w:rFonts w:ascii="Cambria Math" w:hAnsi="Cambria Math"/>
+                        <w:sz w:val="20"/>
                       </w:rPr>
                       <m:t>rad</m:t>
                     </m:r>
@@ -3015,6 +3392,7 @@
                   </m:rPr>
                   <w:rPr>
                     <w:rFonts w:ascii="Cambria Math" w:hAnsi="Cambria Math"/>
+                    <w:sz w:val="20"/>
                   </w:rPr>
                   <w:br/>
                 </m:r>
@@ -3026,6 +3404,7 @@
                   </m:rPr>
                   <w:rPr>
                     <w:rFonts w:ascii="Cambria Math" w:hAnsi="Cambria Math"/>
+                    <w:sz w:val="20"/>
                   </w:rPr>
                   <m:t>[kW]</m:t>
                 </m:r>
@@ -3052,6 +3431,8 @@
           </w:tcPr>
           <w:p>
             <w:pPr>
+              <w:keepNext/>
+              <w:spacing w:after="40" w:before="40"/>
               <w:rPr>
                 <w:rFonts w:ascii="Cambria Math" w:hAnsi="Cambria Math"/>
                 <w:oMath/>
@@ -3088,6 +3469,7 @@
                           </m:rPr>
                           <w:rPr>
                             <w:rFonts w:ascii="Cambria Math" w:hAnsi="Cambria Math"/>
+                            <w:sz w:val="20"/>
                           </w:rPr>
                           <m:t>Q</m:t>
                         </m:r>
@@ -3101,6 +3483,7 @@
                       </m:rPr>
                       <w:rPr>
                         <w:rFonts w:ascii="Cambria Math" w:hAnsi="Cambria Math"/>
+                        <w:sz w:val="20"/>
                       </w:rPr>
                       <m:t>total</m:t>
                     </m:r>
@@ -3112,6 +3495,7 @@
                   </m:rPr>
                   <w:rPr>
                     <w:rFonts w:ascii="Cambria Math" w:hAnsi="Cambria Math"/>
+                    <w:sz w:val="20"/>
                   </w:rPr>
                   <w:br/>
                 </m:r>
@@ -3123,6 +3507,7 @@
                   </m:rPr>
                   <w:rPr>
                     <w:rFonts w:ascii="Cambria Math" w:hAnsi="Cambria Math"/>
+                    <w:sz w:val="20"/>
                   </w:rPr>
                   <m:t>[kW]</m:t>
                 </m:r>
@@ -3154,6 +3539,10 @@
             <w:vAlign w:val="center"/>
           </w:tcPr>
           <w:p>
+            <w:pPr>
+              <w:keepNext/>
+              <w:spacing w:after="40" w:before="40"/>
+            </w:pPr>
             <w:r>
               <w:t>4</w:t>
             </w:r>
@@ -3177,6 +3566,10 @@
             <w:vAlign w:val="center"/>
           </w:tcPr>
           <w:p>
+            <w:pPr>
+              <w:keepNext/>
+              <w:spacing w:after="40" w:before="40"/>
+            </w:pPr>
             <w:r>
               <w:t>0.000</w:t>
             </w:r>
@@ -3199,7 +3592,12 @@
             </w:tcMar>
             <w:vAlign w:val="center"/>
           </w:tcPr>
-          <w:p/>
+          <w:p>
+            <w:pPr>
+              <w:keepNext/>
+              <w:spacing w:after="40" w:before="40"/>
+            </w:pPr>
+          </w:p>
         </w:tc>
         <w:tc>
           <w:tcPr>
@@ -3218,7 +3616,12 @@
             </w:tcMar>
             <w:vAlign w:val="center"/>
           </w:tcPr>
-          <w:p/>
+          <w:p>
+            <w:pPr>
+              <w:keepNext/>
+              <w:spacing w:after="40" w:before="40"/>
+            </w:pPr>
+          </w:p>
         </w:tc>
         <w:tc>
           <w:tcPr>
@@ -3237,7 +3640,12 @@
             </w:tcMar>
             <w:vAlign w:val="center"/>
           </w:tcPr>
-          <w:p/>
+          <w:p>
+            <w:pPr>
+              <w:keepNext/>
+              <w:spacing w:after="40" w:before="40"/>
+            </w:pPr>
+          </w:p>
         </w:tc>
         <w:tc>
           <w:tcPr>
@@ -3256,7 +3664,12 @@
             </w:tcMar>
             <w:vAlign w:val="center"/>
           </w:tcPr>
-          <w:p/>
+          <w:p>
+            <w:pPr>
+              <w:keepNext/>
+              <w:spacing w:after="40" w:before="40"/>
+            </w:pPr>
+          </w:p>
         </w:tc>
         <w:tc>
           <w:tcPr>
@@ -3275,7 +3688,12 @@
             </w:tcMar>
             <w:vAlign w:val="center"/>
           </w:tcPr>
-          <w:p/>
+          <w:p>
+            <w:pPr>
+              <w:keepNext/>
+              <w:spacing w:after="40" w:before="40"/>
+            </w:pPr>
+          </w:p>
         </w:tc>
       </w:tr>
       <w:tr>
@@ -3301,6 +3719,10 @@
             <w:vAlign w:val="center"/>
           </w:tcPr>
           <w:p>
+            <w:pPr>
+              <w:keepNext/>
+              <w:spacing w:after="40" w:before="40"/>
+            </w:pPr>
             <w:r>
               <w:t>5</w:t>
             </w:r>
@@ -3324,6 +3746,10 @@
             <w:vAlign w:val="center"/>
           </w:tcPr>
           <w:p>
+            <w:pPr>
+              <w:keepNext/>
+              <w:spacing w:after="40" w:before="40"/>
+            </w:pPr>
             <w:r>
               <w:t>0.100</w:t>
             </w:r>
@@ -3346,7 +3772,12 @@
             </w:tcMar>
             <w:vAlign w:val="center"/>
           </w:tcPr>
-          <w:p/>
+          <w:p>
+            <w:pPr>
+              <w:keepNext/>
+              <w:spacing w:after="40" w:before="40"/>
+            </w:pPr>
+          </w:p>
         </w:tc>
         <w:tc>
           <w:tcPr>
@@ -3365,7 +3796,12 @@
             </w:tcMar>
             <w:vAlign w:val="center"/>
           </w:tcPr>
-          <w:p/>
+          <w:p>
+            <w:pPr>
+              <w:keepNext/>
+              <w:spacing w:after="40" w:before="40"/>
+            </w:pPr>
+          </w:p>
         </w:tc>
         <w:tc>
           <w:tcPr>
@@ -3384,7 +3820,12 @@
             </w:tcMar>
             <w:vAlign w:val="center"/>
           </w:tcPr>
-          <w:p/>
+          <w:p>
+            <w:pPr>
+              <w:keepNext/>
+              <w:spacing w:after="40" w:before="40"/>
+            </w:pPr>
+          </w:p>
         </w:tc>
         <w:tc>
           <w:tcPr>
@@ -3403,7 +3844,12 @@
             </w:tcMar>
             <w:vAlign w:val="center"/>
           </w:tcPr>
-          <w:p/>
+          <w:p>
+            <w:pPr>
+              <w:keepNext/>
+              <w:spacing w:after="40" w:before="40"/>
+            </w:pPr>
+          </w:p>
         </w:tc>
         <w:tc>
           <w:tcPr>
@@ -3422,7 +3868,12 @@
             </w:tcMar>
             <w:vAlign w:val="center"/>
           </w:tcPr>
-          <w:p/>
+          <w:p>
+            <w:pPr>
+              <w:keepNext/>
+              <w:spacing w:after="40" w:before="40"/>
+            </w:pPr>
+          </w:p>
         </w:tc>
       </w:tr>
       <w:tr>
@@ -3448,6 +3899,10 @@
             <w:vAlign w:val="center"/>
           </w:tcPr>
           <w:p>
+            <w:pPr>
+              <w:keepNext w:val="0"/>
+              <w:spacing w:after="40" w:before="40"/>
+            </w:pPr>
             <w:r>
               <w:t>6</w:t>
             </w:r>
@@ -3471,6 +3926,10 @@
             <w:vAlign w:val="center"/>
           </w:tcPr>
           <w:p>
+            <w:pPr>
+              <w:keepNext w:val="0"/>
+              <w:spacing w:after="40" w:before="40"/>
+            </w:pPr>
             <w:r>
               <w:t>0.150</w:t>
             </w:r>
@@ -3493,7 +3952,12 @@
             </w:tcMar>
             <w:vAlign w:val="center"/>
           </w:tcPr>
-          <w:p/>
+          <w:p>
+            <w:pPr>
+              <w:keepNext w:val="0"/>
+              <w:spacing w:after="40" w:before="40"/>
+            </w:pPr>
+          </w:p>
         </w:tc>
         <w:tc>
           <w:tcPr>
@@ -3512,7 +3976,12 @@
             </w:tcMar>
             <w:vAlign w:val="center"/>
           </w:tcPr>
-          <w:p/>
+          <w:p>
+            <w:pPr>
+              <w:keepNext w:val="0"/>
+              <w:spacing w:after="40" w:before="40"/>
+            </w:pPr>
+          </w:p>
         </w:tc>
         <w:tc>
           <w:tcPr>
@@ -3531,7 +4000,12 @@
             </w:tcMar>
             <w:vAlign w:val="center"/>
           </w:tcPr>
-          <w:p/>
+          <w:p>
+            <w:pPr>
+              <w:keepNext w:val="0"/>
+              <w:spacing w:after="40" w:before="40"/>
+            </w:pPr>
+          </w:p>
         </w:tc>
         <w:tc>
           <w:tcPr>
@@ -3550,7 +4024,12 @@
             </w:tcMar>
             <w:vAlign w:val="center"/>
           </w:tcPr>
-          <w:p/>
+          <w:p>
+            <w:pPr>
+              <w:keepNext w:val="0"/>
+              <w:spacing w:after="40" w:before="40"/>
+            </w:pPr>
+          </w:p>
         </w:tc>
         <w:tc>
           <w:tcPr>
@@ -3569,7 +4048,12 @@
             </w:tcMar>
             <w:vAlign w:val="center"/>
           </w:tcPr>
-          <w:p/>
+          <w:p>
+            <w:pPr>
+              <w:keepNext w:val="0"/>
+              <w:spacing w:after="40" w:before="40"/>
+            </w:pPr>
+          </w:p>
         </w:tc>
       </w:tr>
     </w:tbl>
@@ -3597,13 +4081,25 @@
     </w:p>
     <w:p>
       <w:r>
-        <w:t>Use the relationships below. The radii rᵢ, r</w:t>
+        <w:t xml:space="preserve">Use the relationships below. The radii r</w:t>
+      </w:r>
+      <w:r>
+        <w:rPr>
+          <w:sz w:val="22"/>
+          <w:vertAlign w:val="subscript"/>
+        </w:rPr>
+        <w:t xml:space="preserve">i</w:t>
+      </w:r>
+      <w:r>
+        <w:t xml:space="preserve">, r</w:t>
       </w:r>
       <w:r>
         <w:rPr>
           <w:rFonts w:ascii="Cambria Math" w:hAnsi="Cambria Math" w:cs="Cambria Math"/>
-        </w:rPr>
-        <w:t>ₛ</w:t>
+          <w:sz w:val="22"/>
+          <w:vertAlign w:val="subscript"/>
+        </w:rPr>
+        <w:t xml:space="preserve">s</w:t>
       </w:r>
       <w:r>
         <w:t>, and r</w:t>
@@ -3611,8 +4107,10 @@
       <w:r>
         <w:rPr>
           <w:rFonts w:cs="Arial"/>
-        </w:rPr>
-        <w:t>ₒ</w:t>
+          <w:sz w:val="22"/>
+          <w:vertAlign w:val="subscript"/>
+        </w:rPr>
+        <w:t xml:space="preserve">o</w:t>
       </w:r>
       <w:r>
         <w:t xml:space="preserve"> are the vessel inner radius, bare-steel outer radius, and insulated outer radius; L is the vessel length; k is the thermal conductivity; and R is the cylindrical thermal resistance.</w:t>
@@ -4149,8 +4647,10 @@
       <w:r>
         <w:rPr>
           <w:rFonts w:ascii="Cambria Math" w:hAnsi="Cambria Math" w:cs="Cambria Math"/>
-        </w:rPr>
-        <w:t>ₛ</w:t>
+          <w:sz w:val="22"/>
+          <w:vertAlign w:val="subscript"/>
+        </w:rPr>
+        <w:t xml:space="preserve">s</w:t>
       </w:r>
       <w:r>
         <w:t xml:space="preserve"> and </w:t>
@@ -4326,22 +4826,40 @@
         </w:numPr>
       </w:pPr>
       <w:r>
-        <w:t>Set Tᵢ</w:t>
+        <w:t xml:space="preserve">Set T</w:t>
+      </w:r>
+      <w:r>
+        <w:rPr>
+          <w:sz w:val="22"/>
+          <w:vertAlign w:val="subscript"/>
+        </w:rPr>
+        <w:t xml:space="preserve">i</w:t>
       </w:r>
       <w:r>
         <w:rPr>
           <w:rFonts w:ascii="Cambria Math" w:hAnsi="Cambria Math" w:cs="Cambria Math"/>
-        </w:rPr>
-        <w:t>ₙ</w:t>
-      </w:r>
-      <w:r>
-        <w:t xml:space="preserve"> = 800 °C, kᵢ</w:t>
+          <w:sz w:val="22"/>
+          <w:vertAlign w:val="subscript"/>
+        </w:rPr>
+        <w:t xml:space="preserve">n</w:t>
+      </w:r>
+      <w:r>
+        <w:t xml:space="preserve"> = 800 °C, k</w:t>
+      </w:r>
+      <w:r>
+        <w:rPr>
+          <w:sz w:val="22"/>
+          <w:vertAlign w:val="subscript"/>
+        </w:rPr>
+        <w:t xml:space="preserve">i</w:t>
       </w:r>
       <w:r>
         <w:rPr>
           <w:rFonts w:ascii="Cambria Math" w:hAnsi="Cambria Math" w:cs="Cambria Math"/>
-        </w:rPr>
-        <w:t>ₙₛ</w:t>
+          <w:sz w:val="22"/>
+          <w:vertAlign w:val="subscript"/>
+        </w:rPr>
+        <w:t xml:space="preserve">ns</w:t>
       </w:r>
       <w:r>
         <w:t xml:space="preserve"> = 0.080 W/(</w:t>
@@ -4352,7 +4870,17 @@
       </w:r>
       <w:proofErr w:type="spellEnd"/>
       <w:r>
-        <w:t>), h = 8 W/(m²·K), ε = 0.85.</w:t>
+        <w:t xml:space="preserve">), h = 8 W/(m</w:t>
+      </w:r>
+      <w:r>
+        <w:rPr>
+          <w:sz w:val="22"/>
+          <w:vertAlign w:val="superscript"/>
+        </w:rPr>
+        <w:t xml:space="preserve">2</w:t>
+      </w:r>
+      <w:r>
+        <w:t xml:space="preserve">·K), ε = 0.85.</w:t>
       </w:r>
     </w:p>
     <w:p>
@@ -4368,8 +4896,10 @@
       <w:r>
         <w:rPr>
           <w:rFonts w:ascii="Cambria Math" w:hAnsi="Cambria Math" w:cs="Cambria Math"/>
-        </w:rPr>
-        <w:t>ₛ</w:t>
+          <w:sz w:val="22"/>
+          <w:vertAlign w:val="subscript"/>
+        </w:rPr>
+        <w:t xml:space="preserve">s</w:t>
       </w:r>
       <w:r>
         <w:t xml:space="preserve"> </w:t>
@@ -4466,6 +4996,9 @@
     </w:p>
     <w:p/>
     <w:p>
+      <w:pPr>
+        <w:keepNext/>
+      </w:pPr>
       <w:r>
         <w:rPr>
           <w:b/>
@@ -4516,6 +5049,8 @@
           </w:tcPr>
           <w:p>
             <w:pPr>
+              <w:keepNext/>
+              <w:spacing w:after="40" w:before="40"/>
               <w:rPr>
                 <w:rFonts w:ascii="Cambria Math" w:hAnsi="Cambria Math"/>
                 <w:oMath/>
@@ -4529,6 +5064,7 @@
                   </m:rPr>
                   <w:rPr>
                     <w:rFonts w:ascii="Cambria Math" w:hAnsi="Cambria Math"/>
+                    <w:sz w:val="20"/>
                   </w:rPr>
                   <m:t>Trials</m:t>
                 </m:r>
@@ -4555,6 +5091,8 @@
           </w:tcPr>
           <w:p>
             <w:pPr>
+              <w:keepNext/>
+              <w:spacing w:after="40" w:before="40"/>
               <w:rPr>
                 <w:rFonts w:ascii="Cambria Math" w:hAnsi="Cambria Math"/>
                 <w:oMath/>
@@ -4579,6 +5117,7 @@
                       </m:rPr>
                       <w:rPr>
                         <w:rFonts w:ascii="Cambria Math" w:hAnsi="Cambria Math"/>
+                        <w:sz w:val="20"/>
                       </w:rPr>
                       <m:t>t</m:t>
                     </m:r>
@@ -4590,6 +5129,7 @@
                       </m:rPr>
                       <w:rPr>
                         <w:rFonts w:ascii="Cambria Math" w:hAnsi="Cambria Math"/>
+                        <w:sz w:val="20"/>
                       </w:rPr>
                       <m:t>ins</m:t>
                     </m:r>
@@ -4601,6 +5141,7 @@
                   </m:rPr>
                   <w:rPr>
                     <w:rFonts w:ascii="Cambria Math" w:hAnsi="Cambria Math"/>
+                    <w:sz w:val="20"/>
                   </w:rPr>
                   <w:br/>
                 </m:r>
@@ -4612,6 +5153,7 @@
                   </m:rPr>
                   <w:rPr>
                     <w:rFonts w:ascii="Cambria Math" w:hAnsi="Cambria Math"/>
+                    <w:sz w:val="20"/>
                   </w:rPr>
                   <m:t>[m]</m:t>
                 </m:r>
@@ -4638,6 +5180,8 @@
           </w:tcPr>
           <w:p>
             <w:pPr>
+              <w:keepNext/>
+              <w:spacing w:after="40" w:before="40"/>
               <w:rPr>
                 <w:rFonts w:ascii="Cambria Math" w:hAnsi="Cambria Math"/>
                 <w:oMath/>
@@ -4645,21 +5189,39 @@
             </w:pPr>
             <m:oMathPara>
               <m:oMath>
-                <m:r>
-                  <m:rPr>
-                    <m:sty m:val="bi"/>
-                  </m:rPr>
-                  <w:rPr>
-                    <w:rFonts w:ascii="Cambria Math" w:hAnsi="Cambria Math"/>
-                  </w:rPr>
-                  <m:t>Tₛ</m:t>
-                </m:r>
+                <m:sSub>
+                  <m:e>
+                    <m:r>
+                      <m:rPr>
+                        <m:sty m:val="bi"/>
+                      </m:rPr>
+                      <w:rPr>
+                        <w:rFonts w:ascii="Cambria Math" w:hAnsi="Cambria Math"/>
+                        <w:sz w:val="20"/>
+                      </w:rPr>
+                      <m:t xml:space="preserve">T</m:t>
+                    </m:r>
+                  </m:e>
+                  <m:sub>
+                    <m:r>
+                      <m:rPr>
+                        <m:sty m:val="bi"/>
+                      </m:rPr>
+                      <w:rPr>
+                        <w:rFonts w:ascii="Cambria Math" w:hAnsi="Cambria Math"/>
+                        <w:sz w:val="20"/>
+                      </w:rPr>
+                      <m:t xml:space="preserve">s</m:t>
+                    </m:r>
+                  </m:sub>
+                </m:sSub>
                 <m:r>
                   <m:rPr>
                     <m:sty m:val="p"/>
                   </m:rPr>
                   <w:rPr>
                     <w:rFonts w:ascii="Cambria Math" w:hAnsi="Cambria Math"/>
+                    <w:sz w:val="20"/>
                   </w:rPr>
                   <w:br/>
                 </m:r>
@@ -4671,6 +5233,7 @@
                   </m:rPr>
                   <w:rPr>
                     <w:rFonts w:ascii="Cambria Math" w:hAnsi="Cambria Math"/>
+                    <w:sz w:val="20"/>
                   </w:rPr>
                   <m:t>[°C]</m:t>
                 </m:r>
@@ -4697,6 +5260,8 @@
           </w:tcPr>
           <w:p>
             <w:pPr>
+              <w:keepNext/>
+              <w:spacing w:after="40" w:before="40"/>
               <w:rPr>
                 <w:rFonts w:ascii="Cambria Math" w:hAnsi="Cambria Math"/>
                 <w:oMath/>
@@ -4733,6 +5298,7 @@
                           </m:rPr>
                           <w:rPr>
                             <w:rFonts w:ascii="Cambria Math" w:hAnsi="Cambria Math"/>
+                            <w:sz w:val="20"/>
                           </w:rPr>
                           <m:t>Q</m:t>
                         </m:r>
@@ -4746,6 +5312,7 @@
                       </m:rPr>
                       <w:rPr>
                         <w:rFonts w:ascii="Cambria Math" w:hAnsi="Cambria Math"/>
+                        <w:sz w:val="20"/>
                       </w:rPr>
                       <m:t>conv</m:t>
                     </m:r>
@@ -4757,6 +5324,7 @@
                   </m:rPr>
                   <w:rPr>
                     <w:rFonts w:ascii="Cambria Math" w:hAnsi="Cambria Math"/>
+                    <w:sz w:val="20"/>
                   </w:rPr>
                   <w:br/>
                 </m:r>
@@ -4768,6 +5336,7 @@
                   </m:rPr>
                   <w:rPr>
                     <w:rFonts w:ascii="Cambria Math" w:hAnsi="Cambria Math"/>
+                    <w:sz w:val="20"/>
                   </w:rPr>
                   <m:t>[kW]</m:t>
                 </m:r>
@@ -4794,6 +5363,8 @@
           </w:tcPr>
           <w:p>
             <w:pPr>
+              <w:keepNext/>
+              <w:spacing w:after="40" w:before="40"/>
               <w:rPr>
                 <w:rFonts w:ascii="Cambria Math" w:hAnsi="Cambria Math"/>
                 <w:oMath/>
@@ -4830,6 +5401,7 @@
                           </m:rPr>
                           <w:rPr>
                             <w:rFonts w:ascii="Cambria Math" w:hAnsi="Cambria Math"/>
+                            <w:sz w:val="20"/>
                           </w:rPr>
                           <m:t>Q</m:t>
                         </m:r>
@@ -4843,6 +5415,7 @@
                       </m:rPr>
                       <w:rPr>
                         <w:rFonts w:ascii="Cambria Math" w:hAnsi="Cambria Math"/>
+                        <w:sz w:val="20"/>
                       </w:rPr>
                       <m:t>rad</m:t>
                     </m:r>
@@ -4854,6 +5427,7 @@
                   </m:rPr>
                   <w:rPr>
                     <w:rFonts w:ascii="Cambria Math" w:hAnsi="Cambria Math"/>
+                    <w:sz w:val="20"/>
                   </w:rPr>
                   <w:br/>
                 </m:r>
@@ -4865,6 +5439,7 @@
                   </m:rPr>
                   <w:rPr>
                     <w:rFonts w:ascii="Cambria Math" w:hAnsi="Cambria Math"/>
+                    <w:sz w:val="20"/>
                   </w:rPr>
                   <m:t>[kW]</m:t>
                 </m:r>
@@ -4891,6 +5466,8 @@
           </w:tcPr>
           <w:p>
             <w:pPr>
+              <w:keepNext/>
+              <w:spacing w:after="40" w:before="40"/>
               <w:rPr>
                 <w:rFonts w:ascii="Cambria Math" w:hAnsi="Cambria Math"/>
                 <w:oMath/>
@@ -4926,6 +5503,7 @@
                         </m:rPr>
                         <w:rPr>
                           <w:rFonts w:ascii="Cambria Math" w:hAnsi="Cambria Math"/>
+                          <w:sz w:val="20"/>
                         </w:rPr>
                         <m:t>Q</m:t>
                       </m:r>
@@ -4939,6 +5517,7 @@
                     </m:rPr>
                     <w:rPr>
                       <w:rFonts w:ascii="Cambria Math" w:hAnsi="Cambria Math"/>
+                      <w:sz w:val="20"/>
                     </w:rPr>
                     <m:t>total</m:t>
                   </m:r>
@@ -4948,6 +5527,7 @@
             <w:r>
               <w:rPr>
                 <w:b/>
+                <w:sz w:val="20"/>
               </w:rPr>
               <w:t xml:space="preserve">  </w:t>
             </w:r>
@@ -4958,6 +5538,7 @@
                 </m:rPr>
                 <w:rPr>
                   <w:rFonts w:ascii="Cambria Math" w:hAnsi="Cambria Math"/>
+                  <w:sz w:val="20"/>
                 </w:rPr>
                 <w:br/>
               </m:r>
@@ -4970,6 +5551,7 @@
                   </m:rPr>
                   <w:rPr>
                     <w:rFonts w:ascii="Cambria Math" w:hAnsi="Cambria Math"/>
+                    <w:sz w:val="20"/>
                   </w:rPr>
                   <m:t>[kW]</m:t>
                 </m:r>
@@ -4996,6 +5578,8 @@
           </w:tcPr>
           <w:p>
             <w:pPr>
+              <w:keepNext/>
+              <w:spacing w:after="40" w:before="40"/>
               <w:rPr>
                 <w:rFonts w:ascii="Cambria Math" w:hAnsi="Cambria Math"/>
                 <w:oMath/>
@@ -5009,6 +5593,7 @@
                   </m:rPr>
                   <w:rPr>
                     <w:rFonts w:ascii="Cambria Math" w:hAnsi="Cambria Math"/>
+                    <w:sz w:val="20"/>
                   </w:rPr>
                   <m:t>Pass/Fail</m:t>
                 </m:r>
@@ -5040,6 +5625,10 @@
             <w:vAlign w:val="center"/>
           </w:tcPr>
           <w:p>
+            <w:pPr>
+              <w:keepNext/>
+              <w:spacing w:after="40" w:before="40"/>
+            </w:pPr>
             <w:r>
               <w:t>7</w:t>
             </w:r>
@@ -5066,7 +5655,12 @@
             </w:tcMar>
             <w:vAlign w:val="center"/>
           </w:tcPr>
-          <w:p/>
+          <w:p>
+            <w:pPr>
+              <w:keepNext/>
+              <w:spacing w:after="40" w:before="40"/>
+            </w:pPr>
+          </w:p>
         </w:tc>
         <w:tc>
           <w:tcPr>
@@ -5085,7 +5679,12 @@
             </w:tcMar>
             <w:vAlign w:val="center"/>
           </w:tcPr>
-          <w:p/>
+          <w:p>
+            <w:pPr>
+              <w:keepNext/>
+              <w:spacing w:after="40" w:before="40"/>
+            </w:pPr>
+          </w:p>
         </w:tc>
         <w:tc>
           <w:tcPr>
@@ -5104,7 +5703,12 @@
             </w:tcMar>
             <w:vAlign w:val="center"/>
           </w:tcPr>
-          <w:p/>
+          <w:p>
+            <w:pPr>
+              <w:keepNext/>
+              <w:spacing w:after="40" w:before="40"/>
+            </w:pPr>
+          </w:p>
         </w:tc>
         <w:tc>
           <w:tcPr>
@@ -5123,7 +5727,12 @@
             </w:tcMar>
             <w:vAlign w:val="center"/>
           </w:tcPr>
-          <w:p/>
+          <w:p>
+            <w:pPr>
+              <w:keepNext/>
+              <w:spacing w:after="40" w:before="40"/>
+            </w:pPr>
+          </w:p>
         </w:tc>
         <w:tc>
           <w:tcPr>
@@ -5142,7 +5751,12 @@
             </w:tcMar>
             <w:vAlign w:val="center"/>
           </w:tcPr>
-          <w:p/>
+          <w:p>
+            <w:pPr>
+              <w:keepNext/>
+              <w:spacing w:after="40" w:before="40"/>
+            </w:pPr>
+          </w:p>
         </w:tc>
         <w:tc>
           <w:tcPr>
@@ -5161,7 +5775,12 @@
             </w:tcMar>
             <w:vAlign w:val="center"/>
           </w:tcPr>
-          <w:p/>
+          <w:p>
+            <w:pPr>
+              <w:keepNext/>
+              <w:spacing w:after="40" w:before="40"/>
+            </w:pPr>
+          </w:p>
         </w:tc>
       </w:tr>
       <w:tr>
@@ -5187,6 +5806,10 @@
             <w:vAlign w:val="center"/>
           </w:tcPr>
           <w:p>
+            <w:pPr>
+              <w:keepNext w:val="0"/>
+              <w:spacing w:after="40" w:before="40"/>
+            </w:pPr>
             <w:r>
               <w:t>8</w:t>
             </w:r>
@@ -5213,7 +5836,12 @@
             </w:tcMar>
             <w:vAlign w:val="center"/>
           </w:tcPr>
-          <w:p/>
+          <w:p>
+            <w:pPr>
+              <w:keepNext w:val="0"/>
+              <w:spacing w:after="40" w:before="40"/>
+            </w:pPr>
+          </w:p>
         </w:tc>
         <w:tc>
           <w:tcPr>
@@ -5232,7 +5860,12 @@
             </w:tcMar>
             <w:vAlign w:val="center"/>
           </w:tcPr>
-          <w:p/>
+          <w:p>
+            <w:pPr>
+              <w:keepNext w:val="0"/>
+              <w:spacing w:after="40" w:before="40"/>
+            </w:pPr>
+          </w:p>
         </w:tc>
         <w:tc>
           <w:tcPr>
@@ -5251,7 +5884,12 @@
             </w:tcMar>
             <w:vAlign w:val="center"/>
           </w:tcPr>
-          <w:p/>
+          <w:p>
+            <w:pPr>
+              <w:keepNext w:val="0"/>
+              <w:spacing w:after="40" w:before="40"/>
+            </w:pPr>
+          </w:p>
         </w:tc>
         <w:tc>
           <w:tcPr>
@@ -5270,7 +5908,12 @@
             </w:tcMar>
             <w:vAlign w:val="center"/>
           </w:tcPr>
-          <w:p/>
+          <w:p>
+            <w:pPr>
+              <w:keepNext w:val="0"/>
+              <w:spacing w:after="40" w:before="40"/>
+            </w:pPr>
+          </w:p>
         </w:tc>
         <w:tc>
           <w:tcPr>
@@ -5289,7 +5932,12 @@
             </w:tcMar>
             <w:vAlign w:val="center"/>
           </w:tcPr>
-          <w:p/>
+          <w:p>
+            <w:pPr>
+              <w:keepNext w:val="0"/>
+              <w:spacing w:after="40" w:before="40"/>
+            </w:pPr>
+          </w:p>
         </w:tc>
         <w:tc>
           <w:tcPr>
@@ -5308,7 +5956,12 @@
             </w:tcMar>
             <w:vAlign w:val="center"/>
           </w:tcPr>
-          <w:p/>
+          <w:p>
+            <w:pPr>
+              <w:keepNext w:val="0"/>
+              <w:spacing w:after="40" w:before="40"/>
+            </w:pPr>
+          </w:p>
         </w:tc>
       </w:tr>
     </w:tbl>
@@ -5381,8 +6034,10 @@
       <w:r>
         <w:rPr>
           <w:rFonts w:ascii="Cambria Math" w:hAnsi="Cambria Math" w:cs="Cambria Math"/>
-        </w:rPr>
-        <w:t>ₛ</w:t>
+          <w:sz w:val="22"/>
+          <w:vertAlign w:val="subscript"/>
+        </w:rPr>
+        <w:t xml:space="preserve">s</w:t>
       </w:r>
       <w:r>
         <w:t xml:space="preserve"> </w:t>
@@ -5408,8 +6063,10 @@
       <w:r>
         <w:rPr>
           <w:rFonts w:ascii="Cambria Math" w:hAnsi="Cambria Math" w:cs="Cambria Math"/>
-        </w:rPr>
-        <w:t>ₛ</w:t>
+          <w:sz w:val="22"/>
+          <w:vertAlign w:val="subscript"/>
+        </w:rPr>
+        <w:t xml:space="preserve">s</w:t>
       </w:r>
       <w:r>
         <w:t xml:space="preserve"> is the touchable outer-surface temperature </w:t>

</xml_diff>

<commit_message>
Align all worksheet experiments with 800 C simulation
</commit_message>
<xml_diff>
--- a/labs/parallel-heat-transfer/Parallel_Heat_Transfer_Worksheet.docx
+++ b/labs/parallel-heat-transfer/Parallel_Heat_Transfer_Worksheet.docx
@@ -695,7 +695,7 @@
         </m:sSub>
       </m:oMath>
       <w:r>
-        <w:t xml:space="preserve"> = 400 °C, insulation thickness </w:t>
+        <w:t xml:space="preserve"> = 800 °C, insulation thickness </w:t>
       </w:r>
       <m:oMath>
         <m:sSub>
@@ -2778,7 +2778,7 @@
         </m:sSub>
       </m:oMath>
       <w:r>
-        <w:t xml:space="preserve"> = 600 °C, </w:t>
+        <w:t xml:space="preserve"> = 800 °C, </w:t>
       </w:r>
       <m:oMath>
         <m:sSub>

</xml_diff>

<commit_message>
Clarify wall layers and align worksheet with laboratory controls
</commit_message>
<xml_diff>
--- a/labs/parallel-heat-transfer/Parallel_Heat_Transfer_Worksheet.docx
+++ b/labs/parallel-heat-transfer/Parallel_Heat_Transfer_Worksheet.docx
@@ -119,7 +119,17 @@
         <w:t>This reaction vessel must maintain a constant internal temperature. We want to apply insulation around the steel vessel to reduce heat loss and keep the outer surface safe for people nearby.</w:t>
       </w:r>
     </w:p>
-    <w:p/>
+    <w:p>
+      <w:pPr>
+        <w:spacing w:after="80"/>
+      </w:pPr>
+      <w:r>
+        <w:rPr>
+          <w:sz w:val="20"/>
+        </w:rPr>
+        <w:t>Model assumptions: the inner steel wall is fixed at 800 °C; inside film resistance is neglected. Insulation conductivity is constant at 0.080 W/(m·K). Air and radiative surroundings are both at 25 °C.</w:t>
+      </w:r>
+    </w:p>
     <w:p>
       <w:r>
         <w:t xml:space="preserve">How do you think heat will travel from the hot reactor interior to the surrounding air? </w:t>
@@ -655,6 +665,9 @@
         </w:rPr>
         <w:t>Note: convection transfers heat to the surrounding air, while radiation transfers heat to the surrounding surfaces</w:t>
       </w:r>
+      <w:r>
+        <w:t xml:space="preserve"> The zero values of ε and h are idealized limiting cases. The displayed equivalent radiation coefficient is an optional comparison aid; no additional calculation is required.</w:t>
+      </w:r>
     </w:p>
     <w:p>
       <w:r>
@@ -672,7 +685,7 @@
         </w:numPr>
       </w:pPr>
       <w:r>
-        <w:t xml:space="preserve">Select Case A. Set </w:t>
+        <w:t xml:space="preserve">Click “Parallel paths”. Fixed settings: </w:t>
       </w:r>
       <m:oMath>
         <m:sSub>
@@ -772,6 +785,9 @@
       <w:r>
         <w:t xml:space="preserve">·K). </w:t>
       </w:r>
+      <w:r>
+        <w:t>Click “Run and record trial” and copy the outputs.</w:t>
+      </w:r>
     </w:p>
     <w:p>
       <w:pPr>
@@ -781,7 +797,7 @@
         </w:numPr>
       </w:pPr>
       <w:r>
-        <w:t xml:space="preserve">For Trial 2, change only ε to 0.85 and h to 0 W/(m</w:t>
+        <w:t>For Trial 2, change ε to 0.85 and h to 0 W/(m</w:t>
       </w:r>
       <w:r>
         <w:rPr>
@@ -791,7 +807,7 @@
         <w:t xml:space="preserve">2</w:t>
       </w:r>
       <w:r>
-        <w:t xml:space="preserve">·K). Run the case and record the outputs.</w:t>
+        <w:t>·K). Click “Run and record trial” and copy the outputs.</w:t>
       </w:r>
     </w:p>
     <w:p>
@@ -812,7 +828,7 @@
         <w:t xml:space="preserve">2</w:t>
       </w:r>
       <w:r>
-        <w:t xml:space="preserve">·K). Run the case and record the outputs.</w:t>
+        <w:t>·K). Click “Run and record trial” and copy the outputs.</w:t>
       </w:r>
     </w:p>
     <w:p>
@@ -2717,6 +2733,9 @@
         </w:rPr>
         <w:t>Thermal-network focus for Trials 4–6: process → steel wall → insulation → outer surface is a series conduction path.</w:t>
       </w:r>
+      <w:r>
+        <w:t xml:space="preserve"> The inside-film resistance shown in the schematic is neglected in this simulation.</w:t>
+      </w:r>
     </w:p>
     <w:p>
       <w:pPr>
@@ -2755,7 +2774,7 @@
         </w:numPr>
       </w:pPr>
       <w:r>
-        <w:t xml:space="preserve">Case A. Set </w:t>
+        <w:t xml:space="preserve">Click “Continue to series conduction”. Fixed settings: </w:t>
       </w:r>
       <m:oMath>
         <m:sSub>
@@ -4072,6 +4091,9 @@
       </w:pPr>
     </w:p>
     <w:p>
+      <w:pPr>
+        <w:keepNext/>
+      </w:pPr>
       <w:r>
         <w:rPr>
           <w:b/>
@@ -4759,8 +4781,16 @@
       </w:r>
     </w:p>
     <w:p/>
-    <w:p/>
-    <w:p/>
+    <w:p>
+      <w:pPr>
+        <w:spacing w:after="0" w:before="0" w:line="20" w:lineRule="exact"/>
+      </w:pPr>
+    </w:p>
+    <w:p>
+      <w:pPr>
+        <w:spacing w:after="0" w:before="0" w:line="20" w:lineRule="exact"/>
+      </w:pPr>
+    </w:p>
     <w:p>
       <w:pPr>
         <w:rPr>
@@ -4815,7 +4845,7 @@
           <w:b/>
           <w:bCs/>
         </w:rPr>
-        <w:t>Open Case B in the tab bar</w:t>
+        <w:t>Click “Continue to safety limit”</w:t>
       </w:r>
     </w:p>
     <w:p>
@@ -4826,7 +4856,7 @@
         </w:numPr>
       </w:pPr>
       <w:r>
-        <w:t xml:space="preserve">Set T</w:t>
+        <w:t>Confirm the fixed settings: T</w:t>
       </w:r>
       <w:r>
         <w:rPr>
@@ -4931,7 +4961,7 @@
         </w:numPr>
       </w:pPr>
       <w:r>
-        <w:t>Record that first passing setting as trial 7, including both surface-path heat rates.</w:t>
+        <w:t>Click “Record current trial” to save that first passing setting as trial 7, including both surface-path heat rates.</w:t>
       </w:r>
     </w:p>
     <w:p>
@@ -4980,7 +5010,7 @@
         </m:sSub>
       </m:oMath>
       <w:r>
-        <w:t xml:space="preserve"> by exactly 0.005 m and run the case again. Record this immediately thinner setting as trial 8.</w:t>
+        <w:t xml:space="preserve"> by exactly 0.005 m ; the display updates automatically. Click “Record current trial” to save this immediately thinner setting as trial 8.</w:t>
       </w:r>
     </w:p>
     <w:p>
@@ -7177,6 +7207,9 @@
           <w:rStyle w:val="SubtleReference"/>
         </w:rPr>
         <w:t>Figure 1. Thermal network for the complete vessel system.</w:t>
+      </w:r>
+      <w:r>
+        <w:t xml:space="preserve"> The inside-film resistance is neglected; the specified temperature is applied at the inner steel wall.</w:t>
       </w:r>
     </w:p>
     <w:p>

</xml_diff>